<commit_message>
docs: actualizar Word con explicaciones de capturas
</commit_message>
<xml_diff>
--- a/capturas/PROYECTO COLABORATIVO.docx
+++ b/capturas/PROYECTO COLABORATIVO.docx
@@ -1288,6 +1288,325 @@
                     <a:xfrm>
                       <a:off x="0" y="0"/>
                       <a:ext cx="5400040" cy="915670"/>
+                    </a:xfrm>
+                    <a:prstGeom prst="rect">
+                      <a:avLst/>
+                    </a:prstGeom>
+                  </pic:spPr>
+                </pic:pic>
+              </a:graphicData>
+            </a:graphic>
+          </wp:inline>
+        </w:drawing>
+      </w:r>
+    </w:p>
+    <w:p>
+      <w:proofErr w:type="spellStart"/>
+      <w:r>
+        <w:t>Commit</w:t>
+      </w:r>
+      <w:proofErr w:type="spellEnd"/>
+      <w:r>
+        <w:t xml:space="preserve"> y </w:t>
+      </w:r>
+      <w:proofErr w:type="spellStart"/>
+      <w:r>
+        <w:t>push</w:t>
+      </w:r>
+      <w:proofErr w:type="spellEnd"/>
+      <w:r>
+        <w:t xml:space="preserve"> de las capturas</w:t>
+      </w:r>
+    </w:p>
+    <w:p>
+      <w:r>
+        <w:t xml:space="preserve">Se añade la carpeta capturas/ con el documento del proyecto mediante </w:t>
+      </w:r>
+      <w:proofErr w:type="spellStart"/>
+      <w:r>
+        <w:t>git</w:t>
+      </w:r>
+      <w:proofErr w:type="spellEnd"/>
+      <w:r>
+        <w:t xml:space="preserve"> </w:t>
+      </w:r>
+      <w:proofErr w:type="spellStart"/>
+      <w:r>
+        <w:t>add</w:t>
+      </w:r>
+      <w:proofErr w:type="spellEnd"/>
+      <w:r>
+        <w:t xml:space="preserve"> capturas/, se realiza un nuevo </w:t>
+      </w:r>
+      <w:proofErr w:type="spellStart"/>
+      <w:r>
+        <w:t>commit</w:t>
+      </w:r>
+      <w:proofErr w:type="spellEnd"/>
+      <w:r>
+        <w:t xml:space="preserve"> con el mensaje "</w:t>
+      </w:r>
+      <w:proofErr w:type="spellStart"/>
+      <w:r>
+        <w:t>docs</w:t>
+      </w:r>
+      <w:proofErr w:type="spellEnd"/>
+      <w:r>
+        <w:t xml:space="preserve">: añadir capturas del proceso </w:t>
+      </w:r>
+      <w:proofErr w:type="spellStart"/>
+      <w:r>
+        <w:t>git</w:t>
+      </w:r>
+      <w:proofErr w:type="spellEnd"/>
+      <w:r>
+        <w:t xml:space="preserve">" y se sube al repositorio remoto con </w:t>
+      </w:r>
+      <w:proofErr w:type="spellStart"/>
+      <w:r>
+        <w:t>git</w:t>
+      </w:r>
+      <w:proofErr w:type="spellEnd"/>
+      <w:r>
+        <w:t xml:space="preserve"> </w:t>
+      </w:r>
+      <w:proofErr w:type="spellStart"/>
+      <w:r>
+        <w:t>push</w:t>
+      </w:r>
+      <w:proofErr w:type="spellEnd"/>
+      <w:r>
+        <w:t xml:space="preserve"> </w:t>
+      </w:r>
+      <w:proofErr w:type="spellStart"/>
+      <w:r>
+        <w:t>origin</w:t>
+      </w:r>
+      <w:proofErr w:type="spellEnd"/>
+      <w:r>
+        <w:t xml:space="preserve"> </w:t>
+      </w:r>
+      <w:proofErr w:type="spellStart"/>
+      <w:r>
+        <w:t>main</w:t>
+      </w:r>
+      <w:proofErr w:type="spellEnd"/>
+      <w:r>
+        <w:t>. Git confirma que la subida se completó correctamente.</w:t>
+      </w:r>
+    </w:p>
+    <w:p>
+      <w:r>
+        <w:drawing>
+          <wp:inline distT="0" distB="0" distL="0" distR="0" wp14:anchorId="613AE866" wp14:editId="16BDB029">
+            <wp:extent cx="5400040" cy="2623820"/>
+            <wp:effectExtent l="0" t="0" r="0" b="5080"/>
+            <wp:docPr id="1821360490" name="Imagen 1"/>
+            <wp:cNvGraphicFramePr>
+              <a:graphicFrameLocks xmlns:a="http://schemas.openxmlformats.org/drawingml/2006/main" noChangeAspect="1"/>
+            </wp:cNvGraphicFramePr>
+            <a:graphic xmlns:a="http://schemas.openxmlformats.org/drawingml/2006/main">
+              <a:graphicData uri="http://schemas.openxmlformats.org/drawingml/2006/picture">
+                <pic:pic xmlns:pic="http://schemas.openxmlformats.org/drawingml/2006/picture">
+                  <pic:nvPicPr>
+                    <pic:cNvPr id="1821360490" name=""/>
+                    <pic:cNvPicPr/>
+                  </pic:nvPicPr>
+                  <pic:blipFill>
+                    <a:blip r:embed="rId20"/>
+                    <a:stretch>
+                      <a:fillRect/>
+                    </a:stretch>
+                  </pic:blipFill>
+                  <pic:spPr>
+                    <a:xfrm>
+                      <a:off x="0" y="0"/>
+                      <a:ext cx="5400040" cy="2623820"/>
+                    </a:xfrm>
+                    <a:prstGeom prst="rect">
+                      <a:avLst/>
+                    </a:prstGeom>
+                  </pic:spPr>
+                </pic:pic>
+              </a:graphicData>
+            </a:graphic>
+          </wp:inline>
+        </w:drawing>
+      </w:r>
+    </w:p>
+    <w:p>
+      <w:r>
+        <w:t xml:space="preserve">— Acceso a la sección de </w:t>
+      </w:r>
+      <w:proofErr w:type="spellStart"/>
+      <w:r>
+        <w:t>Collaborators</w:t>
+      </w:r>
+      <w:proofErr w:type="spellEnd"/>
+    </w:p>
+    <w:p>
+      <w:r>
+        <w:t>Desde la configuración del repositorio en GitHub (</w:t>
+      </w:r>
+      <w:proofErr w:type="spellStart"/>
+      <w:r>
+        <w:t>Settings</w:t>
+      </w:r>
+      <w:proofErr w:type="spellEnd"/>
+      <w:r>
+        <w:t xml:space="preserve"> → </w:t>
+      </w:r>
+      <w:proofErr w:type="spellStart"/>
+      <w:r>
+        <w:t>Collaborators</w:t>
+      </w:r>
+      <w:proofErr w:type="spellEnd"/>
+      <w:r>
+        <w:t>) se accede a la sección de gestión de acceso para añadir al profesor como colaborador. En este momento el repositorio aún no tiene colaboradores invitados.</w:t>
+      </w:r>
+    </w:p>
+    <w:p>
+      <w:r>
+        <w:drawing>
+          <wp:inline distT="0" distB="0" distL="0" distR="0" wp14:anchorId="3E0B5DC3" wp14:editId="29CDD166">
+            <wp:extent cx="5400040" cy="2684145"/>
+            <wp:effectExtent l="0" t="0" r="0" b="1905"/>
+            <wp:docPr id="936723824" name="Imagen 1"/>
+            <wp:cNvGraphicFramePr>
+              <a:graphicFrameLocks xmlns:a="http://schemas.openxmlformats.org/drawingml/2006/main" noChangeAspect="1"/>
+            </wp:cNvGraphicFramePr>
+            <a:graphic xmlns:a="http://schemas.openxmlformats.org/drawingml/2006/main">
+              <a:graphicData uri="http://schemas.openxmlformats.org/drawingml/2006/picture">
+                <pic:pic xmlns:pic="http://schemas.openxmlformats.org/drawingml/2006/picture">
+                  <pic:nvPicPr>
+                    <pic:cNvPr id="936723824" name=""/>
+                    <pic:cNvPicPr/>
+                  </pic:nvPicPr>
+                  <pic:blipFill>
+                    <a:blip r:embed="rId21"/>
+                    <a:stretch>
+                      <a:fillRect/>
+                    </a:stretch>
+                  </pic:blipFill>
+                  <pic:spPr>
+                    <a:xfrm>
+                      <a:off x="0" y="0"/>
+                      <a:ext cx="5400040" cy="2684145"/>
+                    </a:xfrm>
+                    <a:prstGeom prst="rect">
+                      <a:avLst/>
+                    </a:prstGeom>
+                  </pic:spPr>
+                </pic:pic>
+              </a:graphicData>
+            </a:graphic>
+          </wp:inline>
+        </w:drawing>
+      </w:r>
+    </w:p>
+    <w:p>
+      <w:r>
+        <w:lastRenderedPageBreak/>
+        <w:t>— Invitación al profesor</w:t>
+      </w:r>
+    </w:p>
+    <w:p>
+      <w:r>
+        <w:t>Se introduce el correo del profesor bchomed114@g.educaand.es en el buscador de colaboradores y se hace clic en el botón Add bchomed114@g.educaand.es para enviarle la invitación de acceso al repositorio.</w:t>
+      </w:r>
+    </w:p>
+    <w:p>
+      <w:r>
+        <w:drawing>
+          <wp:inline distT="0" distB="0" distL="0" distR="0" wp14:anchorId="56395B7A" wp14:editId="350D6BB3">
+            <wp:extent cx="5400040" cy="1949450"/>
+            <wp:effectExtent l="0" t="0" r="0" b="0"/>
+            <wp:docPr id="1169756448" name="Imagen 1"/>
+            <wp:cNvGraphicFramePr>
+              <a:graphicFrameLocks xmlns:a="http://schemas.openxmlformats.org/drawingml/2006/main" noChangeAspect="1"/>
+            </wp:cNvGraphicFramePr>
+            <a:graphic xmlns:a="http://schemas.openxmlformats.org/drawingml/2006/main">
+              <a:graphicData uri="http://schemas.openxmlformats.org/drawingml/2006/picture">
+                <pic:pic xmlns:pic="http://schemas.openxmlformats.org/drawingml/2006/picture">
+                  <pic:nvPicPr>
+                    <pic:cNvPr id="1169756448" name=""/>
+                    <pic:cNvPicPr/>
+                  </pic:nvPicPr>
+                  <pic:blipFill>
+                    <a:blip r:embed="rId22"/>
+                    <a:stretch>
+                      <a:fillRect/>
+                    </a:stretch>
+                  </pic:blipFill>
+                  <pic:spPr>
+                    <a:xfrm>
+                      <a:off x="0" y="0"/>
+                      <a:ext cx="5400040" cy="1949450"/>
+                    </a:xfrm>
+                    <a:prstGeom prst="rect">
+                      <a:avLst/>
+                    </a:prstGeom>
+                  </pic:spPr>
+                </pic:pic>
+              </a:graphicData>
+            </a:graphic>
+          </wp:inline>
+        </w:drawing>
+      </w:r>
+    </w:p>
+    <w:p>
+      <w:r>
+        <w:t>— Profesor añadido correctamente</w:t>
+      </w:r>
+    </w:p>
+    <w:p>
+      <w:r>
+        <w:t xml:space="preserve">Confirmación de que la invitación ha sido enviada correctamente al profesor. Aparece el usuario </w:t>
+      </w:r>
+      <w:proofErr w:type="spellStart"/>
+      <w:r>
+        <w:t>bartchoza</w:t>
+      </w:r>
+      <w:proofErr w:type="spellEnd"/>
+      <w:r>
+        <w:t xml:space="preserve"> en la lista de acceso con el estado </w:t>
+      </w:r>
+      <w:proofErr w:type="spellStart"/>
+      <w:r>
+        <w:t>Pending</w:t>
+      </w:r>
+      <w:proofErr w:type="spellEnd"/>
+      <w:r>
+        <w:t xml:space="preserve"> Invite, lo que significa que el profesor recibirá un email para aceptar la invitación y acceder al repositorio.</w:t>
+      </w:r>
+    </w:p>
+    <w:p>
+      <w:r>
+        <w:drawing>
+          <wp:inline distT="0" distB="0" distL="0" distR="0" wp14:anchorId="2259EB8C" wp14:editId="06371963">
+            <wp:extent cx="5400040" cy="2569845"/>
+            <wp:effectExtent l="0" t="0" r="0" b="1905"/>
+            <wp:docPr id="68207892" name="Imagen 1"/>
+            <wp:cNvGraphicFramePr>
+              <a:graphicFrameLocks xmlns:a="http://schemas.openxmlformats.org/drawingml/2006/main" noChangeAspect="1"/>
+            </wp:cNvGraphicFramePr>
+            <a:graphic xmlns:a="http://schemas.openxmlformats.org/drawingml/2006/main">
+              <a:graphicData uri="http://schemas.openxmlformats.org/drawingml/2006/picture">
+                <pic:pic xmlns:pic="http://schemas.openxmlformats.org/drawingml/2006/picture">
+                  <pic:nvPicPr>
+                    <pic:cNvPr id="68207892" name=""/>
+                    <pic:cNvPicPr/>
+                  </pic:nvPicPr>
+                  <pic:blipFill>
+                    <a:blip r:embed="rId23"/>
+                    <a:stretch>
+                      <a:fillRect/>
+                    </a:stretch>
+                  </pic:blipFill>
+                  <pic:spPr>
+                    <a:xfrm>
+                      <a:off x="0" y="0"/>
+                      <a:ext cx="5400040" cy="2569845"/>
                     </a:xfrm>
                     <a:prstGeom prst="rect">
                       <a:avLst/>

</xml_diff>